<commit_message>
Update behavioral analytics project report
</commit_message>
<xml_diff>
--- a/Behavioral Analytics Project Report.docx
+++ b/Behavioral Analytics Project Report.docx
@@ -14629,7 +14629,10 @@
         <w:pStyle w:val="Heading2"/>
       </w:pPr>
       <w:r>
-        <w:t>8.1 Prioritize Scarcity-Based Marketing</w:t>
+        <w:t>7</w:t>
+      </w:r>
+      <w:r>
+        <w:t>.1 Prioritize Scarcity-Based Marketing</w:t>
       </w:r>
     </w:p>
     <w:p>
@@ -14691,7 +14694,10 @@
         <w:pStyle w:val="Heading2"/>
       </w:pPr>
       <w:r>
-        <w:t>8.2 Utilize Social Proof Strategically</w:t>
+        <w:t>7</w:t>
+      </w:r>
+      <w:r>
+        <w:t>.2 Utilize Social Proof Strategically</w:t>
       </w:r>
     </w:p>
     <w:p>
@@ -14835,7 +14841,10 @@
         <w:pStyle w:val="Heading2"/>
       </w:pPr>
       <w:r>
-        <w:t>8.3 Offer Free Shipping as a Customer Acquisition Strategy</w:t>
+        <w:t>7</w:t>
+      </w:r>
+      <w:r>
+        <w:t>.3 Offer Free Shipping as a Customer Acquisition Strategy</w:t>
       </w:r>
     </w:p>
     <w:p>
@@ -14963,7 +14972,10 @@
         <w:pStyle w:val="Heading2"/>
       </w:pPr>
       <w:r>
-        <w:t>8.4 Reduce Decision Friction</w:t>
+        <w:t>7</w:t>
+      </w:r>
+      <w:r>
+        <w:t>.4 Reduce Decision Friction</w:t>
       </w:r>
     </w:p>
     <w:p>
@@ -15112,7 +15124,10 @@
         <w:pStyle w:val="Heading2"/>
       </w:pPr>
       <w:r>
-        <w:t>8.5 Personalize Marketing Based on Customer Segments</w:t>
+        <w:t>7</w:t>
+      </w:r>
+      <w:r>
+        <w:t>.5 Personalize Marketing Based on Customer Segments</w:t>
       </w:r>
     </w:p>
     <w:p>
@@ -15266,7 +15281,10 @@
         <w:pStyle w:val="Heading2"/>
       </w:pPr>
       <w:r>
-        <w:t>8.6 Optimize Discount Strategies</w:t>
+        <w:t>7</w:t>
+      </w:r>
+      <w:r>
+        <w:t>.6 Optimize Discount Strategies</w:t>
       </w:r>
     </w:p>
     <w:p>
@@ -15393,7 +15411,10 @@
         <w:pStyle w:val="Heading2"/>
       </w:pPr>
       <w:r>
-        <w:t xml:space="preserve">8.7 Adopt Data-Driven </w:t>
+        <w:t>7</w:t>
+      </w:r>
+      <w:r>
+        <w:t xml:space="preserve">.7 Adopt Data-Driven </w:t>
       </w:r>
       <w:proofErr w:type="spellStart"/>
       <w:r>
@@ -15489,7 +15510,10 @@
         <w:pStyle w:val="Heading2"/>
       </w:pPr>
       <w:r>
-        <w:t xml:space="preserve">8.8 Conduct Continuous </w:t>
+        <w:t>7</w:t>
+      </w:r>
+      <w:r>
+        <w:t xml:space="preserve">.8 Conduct Continuous </w:t>
       </w:r>
       <w:proofErr w:type="spellStart"/>
       <w:r>
@@ -15552,7 +15576,7 @@
           <w:szCs w:val="48"/>
         </w:rPr>
         <w:lastRenderedPageBreak/>
-        <w:t>CHAPTER 9</w:t>
+        <w:t>CHAPTER 8</w:t>
       </w:r>
     </w:p>
     <w:p>
@@ -15751,7 +15775,17 @@
       </w:pPr>
       <w:r>
         <w:lastRenderedPageBreak/>
-        <w:t>CHAPTER 8 — AI-POWERED RAG ASSISTANT</w:t>
+        <w:t>CHAPTER 8</w:t>
+      </w:r>
+      <w:bookmarkStart w:id="0" w:name="_GoBack"/>
+      <w:bookmarkEnd w:id="0"/>
+    </w:p>
+    <w:p>
+      <w:pPr>
+        <w:pStyle w:val="Heading1"/>
+      </w:pPr>
+      <w:r>
+        <w:t>AI-POWERED RAG ASSISTANT</w:t>
       </w:r>
     </w:p>
     <w:p>
@@ -15927,7 +15961,6 @@
         <w:pStyle w:val="HTMLPreformatted"/>
         <w:jc w:val="center"/>
       </w:pPr>
-      <w:bookmarkStart w:id="0" w:name="_GoBack"/>
       <w:r>
         <w:t>User Question</w:t>
       </w:r>
@@ -16019,16 +16052,15 @@
         <w:jc w:val="center"/>
       </w:pPr>
       <w:r>
+        <w:lastRenderedPageBreak/>
         <w:t>AI Answer</w:t>
       </w:r>
     </w:p>
-    <w:bookmarkEnd w:id="0"/>
-    <w:p>
-      <w:pPr>
-        <w:pStyle w:val="NormalWeb"/>
-      </w:pPr>
-      <w:r>
-        <w:lastRenderedPageBreak/>
+    <w:p>
+      <w:pPr>
+        <w:pStyle w:val="NormalWeb"/>
+      </w:pPr>
+      <w:r>
         <w:t>The project findings were converted into smaller knowledge chunks and stored in a structured knowledge base.</w:t>
       </w:r>
     </w:p>
@@ -16312,6 +16344,7 @@
         <w:spacing w:before="100" w:beforeAutospacing="1" w:after="100" w:afterAutospacing="1" w:line="240" w:lineRule="auto"/>
       </w:pPr>
       <w:r>
+        <w:lastRenderedPageBreak/>
         <w:t xml:space="preserve">The relevant project evidence retrieved by the RAG system </w:t>
       </w:r>
     </w:p>
@@ -16332,7 +16365,6 @@
         <w:pStyle w:val="NormalWeb"/>
       </w:pPr>
       <w:r>
-        <w:lastRenderedPageBreak/>
         <w:t>The assistant is also instructed to indicate when sufficient project information is not available.</w:t>
       </w:r>
     </w:p>
@@ -16581,7 +16613,6 @@
         <w:rPr>
           <w:rStyle w:val="Strong"/>
         </w:rPr>
-        <w:lastRenderedPageBreak/>
         <w:t>Figure 8.2 – AI Assistant with Retrieved Answer</w:t>
       </w:r>
     </w:p>
@@ -16768,6 +16799,7 @@
         <w:rPr>
           <w:rStyle w:val="Strong"/>
         </w:rPr>
+        <w:lastRenderedPageBreak/>
         <w:t>What is the capital of France?</w:t>
       </w:r>
     </w:p>
@@ -16776,7 +16808,6 @@
         <w:pStyle w:val="NormalWeb"/>
       </w:pPr>
       <w:r>
-        <w:lastRenderedPageBreak/>
         <w:t xml:space="preserve">Since this information is not part of the project knowledge base, the assistant responded that the </w:t>
       </w:r>
       <w:r>
@@ -23785,7 +23816,7 @@
 </file>
 
 <file path=customXml/itemProps1.xml><?xml version="1.0" encoding="utf-8"?>
-<ds:datastoreItem xmlns:ds="http://schemas.openxmlformats.org/officeDocument/2006/customXml" ds:itemID="{8895C185-4A70-426A-8A33-21A21D2896C1}">
+<ds:datastoreItem xmlns:ds="http://schemas.openxmlformats.org/officeDocument/2006/customXml" ds:itemID="{D8FB646F-B2C5-4D1C-9DF6-5C81E9E0D0D4}">
   <ds:schemaRefs>
     <ds:schemaRef ds:uri="http://schemas.openxmlformats.org/officeDocument/2006/bibliography"/>
   </ds:schemaRefs>

</xml_diff>